<commit_message>
Fix uncited references in Ebin Joseph's report
References 5-7 (avalanche seismic-sensing, Dynamo, serverless cold
starts) were listed but never actually cited in the body text -- a
verification workflow caught it independently. Added the missing
in-text citations at their natural spots and renumbered all seven
references to strict order of first citation.
</commit_message>
<xml_diff>
--- a/documents/EbinJoseph_X25142224/EbinJoseph_X25142224.docx
+++ b/documents/EbinJoseph_X25142224/EbinJoseph_X25142224.docx
@@ -182,7 +182,7 @@
         <w:pStyle w:val="BodyText"/>
       </w:pPr>
       <w:r>
-        <w:t xml:space="preserve">Two simulated slopes, slope-a and slope-b, each carry five sensor types: snowpack depth (snowpack_depth_cm), snow temperature (snow_temp_c), wind speed (wind_speed_kmh), seismic vibration (seismic_vibration_mg, a stand-in for the acoustic precursor signal avalanche-monitoring literature associates with slab failure), and lift chair count (lift_chair_count, an operational rather than a hazard signal). Each sensor process runs two independent, AbortController-coordinated setTimeout loops rather than a single combined timer: one samples a bounded random walk into a local outbox at SAMPLE_INTERVAL, the other drains that whole outbox in one POST at DISPATCH_INTERVAL, restoring the batch to the front of the outbox if the request fails so nothing sampled while a dispatch was in flight is lost or reordered.</w:t>
+        <w:t xml:space="preserve">Two simulated slopes, slope-a and slope-b, each carry five sensor types: snowpack depth (snowpack_depth_cm), snow temperature (snow_temp_c), wind speed (wind_speed_kmh), seismic vibration (seismic_vibration_mg, a stand-in for the acoustic precursor signal avalanche-monitoring literature associates with slab failure [3]), and lift chair count (lift_chair_count, an operational rather than a hazard signal). Each sensor process runs two independent, AbortController-coordinated setTimeout loops rather than a single combined timer: one samples a bounded random walk into a local outbox at SAMPLE_INTERVAL, the other drains that whole outbox in one POST at DISPATCH_INTERVAL, restoring the batch to the front of the outbox if the request fails so nothing sampled while a dispatch was in flight is lost or reordered.</w:t>
       </w:r>
     </w:p>
     <w:p>
@@ -468,7 +468,7 @@
         <w:pStyle w:val="BodyText"/>
       </w:pPr>
       <w:r>
-        <w:t xml:space="preserve">The fog gateway's HTTP surface -- /health, /thresholds, and POST /ingest -- is dispatched through a switch(true) statement over a composed `${method} ${pathname}` string, deliberately avoiding Express, an if/else chain, a tuple table, or a routing trie. Node's event-driven, non-blocking I/O model is what makes a plain http server a reasonable choice here at all: Tilkov and Vinoski describe how Node.js trades a thread-per-connection model for a single event loop plus asynchronous I/O, favouring workloads with many concurrent, short-lived connections over CPU-bound work [3], which matches this gateway's job of accepting frequent small POSTs from ten sensor processes rather than performing heavy computation.</w:t>
+        <w:t xml:space="preserve">The fog gateway's HTTP surface -- /health, /thresholds, and POST /ingest -- is dispatched through a switch(true) statement over a composed `${method} ${pathname}` string, deliberately avoiding Express, an if/else chain, a tuple table, or a routing trie. Node's event-driven, non-blocking I/O model is what makes a plain http server a reasonable choice here at all: Tilkov and Vinoski describe how Node.js trades a thread-per-connection model for a single event loop plus asynchronous I/O, favouring workloads with many concurrent, short-lived connections over CPU-bound work [4], which matches this gateway's job of accepting frequent small POSTs from ten sensor processes rather than performing heavy computation.</w:t>
       </w:r>
     </w:p>
     <w:p>
@@ -492,15 +492,15 @@
         <w:pStyle w:val="BodyText"/>
       </w:pPr>
       <w:r>
-        <w:t xml:space="preserve">sensor_type is the table's partition key, but two slopes closing the same sensor type in the same flush window would otherwise collide on an identical sort key. transform.js resolves this with sort_key = window_end#site_id: folding site_id into the sort key rather than using a separate global secondary index keeps every slope's reading for a given window in its own row under the same partition, retrievable with a single Query rather than a Scan plus a filter.</w:t>
-      </w:r>
-    </w:p>
-    <w:p>
-      <w:pPr>
-        <w:pStyle w:val="BodyText"/>
-      </w:pPr>
-      <w:r>
-        <w:t xml:space="preserve">Cold starts are the standard critique levelled at Lambda-based designs, and this pipeline is exposed to them in two different places with two different consequences. ska-processor is queue-triggered, so a slow cold start only delays how quickly a buffered message is drained, never how quickly a browser renders anything, since nothing is waiting on that invocation directly. ska-dashboard-api sits on the read path a browser actually waits on, but its own container tends to stay warm on its own: the dashboard polls it every 2.5 seconds while a page is open, and that polling cadence is frequent enough in practice to keep a cold start from being the common case.</w:t>
+        <w:t xml:space="preserve">sensor_type is the table's partition key, but two slopes closing the same sensor type in the same flush window would otherwise collide on an identical sort key. transform.js resolves this with sort_key = window_end#site_id: folding site_id into the sort key rather than using a separate global secondary index keeps every slope's reading for a given window in its own row under the same partition, retrievable with a single Query rather than a Scan plus a filter -- the same partition-key-plus-derived-attribute pattern DeCandia et al. describe as central to how Amazon's own internal Dynamo store achieves single-digit-millisecond reads at scale [5].</w:t>
+      </w:r>
+    </w:p>
+    <w:p>
+      <w:pPr>
+        <w:pStyle w:val="BodyText"/>
+      </w:pPr>
+      <w:r>
+        <w:t xml:space="preserve">Cold starts are the standard critique levelled at Lambda-based designs -- one Shahrad et al.'s large-scale characterisation of a real production serverless workload found significant enough to shape how that workload gets scheduled and provisioned [6] -- and this pipeline is exposed to them in two different places with two different consequences. ska-processor is queue-triggered, so a slow cold start only delays how quickly a buffered message is drained, never how quickly a browser renders anything, since nothing is waiting on that invocation directly. ska-dashboard-api sits on the read path a browser actually waits on, but its own container tends to stay warm on its own: the dashboard polls it every 2.5 seconds while a page is open, and that polling cadence is frequent enough in practice to keep a cold start from being the common case.</w:t>
       </w:r>
     </w:p>
     <w:p>
@@ -688,7 +688,7 @@
         <w:pStyle w:val="BodyText"/>
       </w:pPr>
       <w:r>
-        <w:t xml:space="preserve">Both Lambda functions run under the one LabRole this Learner Lab account provides, since the account has no path for a student to create a new IAM role of their own; that is an account limitation, not a design decision made freely. A properly split policy would leave ska-dashboard-api holding only read access to DynamoDB, to the queue's attributes, and to Lambda metadata, and would trim ska-processor down to sqs:ReceiveMessage, sqs:DeleteMessage, and dynamodb:PutItem -- a noticeably narrower footprint than the shared role grants either function today out of necessity. The dashboard's REST API carries no authentication layer, which was a considered choice: everything it returns is an aggregated, non-personal reading from a simulated sensor, so there is nothing sensitive an auth check would be guarding. That same API answers any origin via a wildcard CORS header, and Chen et al.'s empirical study of CORS deployments in the wild found that a large fraction of real-world misconfigurations occur at exactly this boundary, either reflecting arbitrary origins back with credentials permitted or leaving internal endpoints reachable cross-origin unintentionally [4] -- a caution this deployment sidesteps only because it never pairs a wildcard origin with credentialed requests in the first place, not because the underlying risk is absent.</w:t>
+        <w:t xml:space="preserve">Both Lambda functions run under the one LabRole this Learner Lab account provides, since the account has no path for a student to create a new IAM role of their own; that is an account limitation, not a design decision made freely. A properly split policy would leave ska-dashboard-api holding only read access to DynamoDB, to the queue's attributes, and to Lambda metadata, and would trim ska-processor down to sqs:ReceiveMessage, sqs:DeleteMessage, and dynamodb:PutItem -- a noticeably narrower footprint than the shared role grants either function today out of necessity. The dashboard's REST API carries no authentication layer, which was a considered choice: everything it returns is an aggregated, non-personal reading from a simulated sensor, so there is nothing sensitive an auth check would be guarding. That same API answers any origin via a wildcard CORS header, and Chen et al.'s empirical study of CORS deployments in the wild found that a large fraction of real-world misconfigurations occur at exactly this boundary, either reflecting arbitrary origins back with credentials permitted or leaving internal endpoints reachable cross-origin unintentionally [7] -- a caution this deployment sidesteps only because it never pairs a wildcard origin with credentialed requests in the first place, not because the underlying risk is absent.</w:t>
       </w:r>
     </w:p>
     <w:p>
@@ -1238,6 +1238,14 @@
         <w:pStyle w:val="references"/>
       </w:pPr>
       <w:r>
+        <w:t xml:space="preserve">A. van Herwijnen and J. Schweizer, “Monitoring avalanche activity using a seismic sensor,” Cold Regions Science and Technology, vol. 69, no. 2–3, pp. 165–176, 2011.</w:t>
+      </w:r>
+    </w:p>
+    <w:p>
+      <w:pPr>
+        <w:pStyle w:val="references"/>
+      </w:pPr>
+      <w:r>
         <w:t xml:space="preserve">S. Tilkov and S. Vinoski, “Node.js: Using JavaScript to build high-performance network programs,” IEEE Internet Computing, vol. 14, no. 6, pp. 80–83, Nov. 2010.</w:t>
       </w:r>
     </w:p>
@@ -1246,31 +1254,23 @@
         <w:pStyle w:val="references"/>
       </w:pPr>
       <w:r>
+        <w:t xml:space="preserve">G. DeCandia et al., “Dynamo: Amazon’s highly available key-value store,” in Proc. 21st ACM SIGOPS Symp. Operating Systems Principles (SOSP ’07), Stevenson, WA, USA, Oct. 2007, pp. 205–220.</w:t>
+      </w:r>
+    </w:p>
+    <w:p>
+      <w:pPr>
+        <w:pStyle w:val="references"/>
+      </w:pPr>
+      <w:r>
+        <w:t xml:space="preserve">M. Shahrad et al., “Serverless in the wild: Characterizing and optimizing the serverless workload at a large cloud provider,” in Proc. 2020 USENIX Annu. Tech. Conf. (USENIX ATC ’20), Jul. 2020, pp. 205–218.</w:t>
+      </w:r>
+    </w:p>
+    <w:p>
+      <w:pPr>
+        <w:pStyle w:val="references"/>
+      </w:pPr>
+      <w:r>
         <w:t xml:space="preserve">J. Chen, J. Jiang, H. Duan, T. Wan, S. Chen, V. Paxson, and M. Yang, “We still don’t have secure cross-domain requests: An empirical study of CORS,” in Proc. 27th USENIX Security Symp. (USENIX Security ’18), Baltimore, MD, USA, Aug. 2018, pp. 1079–1093.</w:t>
-      </w:r>
-    </w:p>
-    <w:p>
-      <w:pPr>
-        <w:pStyle w:val="references"/>
-      </w:pPr>
-      <w:r>
-        <w:t xml:space="preserve">A. van Herwijnen and J. Schweizer, “Monitoring avalanche activity using a seismic sensor,” Cold Regions Science and Technology, vol. 69, no. 2–3, pp. 165–176, 2011.</w:t>
-      </w:r>
-    </w:p>
-    <w:p>
-      <w:pPr>
-        <w:pStyle w:val="references"/>
-      </w:pPr>
-      <w:r>
-        <w:t xml:space="preserve">G. DeCandia et al., “Dynamo: Amazon’s highly available key-value store,” in Proc. 21st ACM SIGOPS Symp. Operating Systems Principles (SOSP ’07), Stevenson, WA, USA, Oct. 2007, pp. 205–220.</w:t>
-      </w:r>
-    </w:p>
-    <w:p>
-      <w:pPr>
-        <w:pStyle w:val="references"/>
-      </w:pPr>
-      <w:r>
-        <w:t xml:space="preserve">M. Shahrad et al., “Serverless in the wild: Characterizing and optimizing the serverless workload at a large cloud provider,” in Proc. 2020 USENIX Annu. Tech. Conf. (USENIX ATC ’20), Jul. 2020, pp. 205–218.</w:t>
       </w:r>
     </w:p>
     <w:sectPr>

</xml_diff>

<commit_message>
Move table captions above their tables per IEEE convention
The format audit found all of Hrishikesh's, Ebin's, Jaipal's, and
Goutham's table captions placed below their tables (only figure
captions belong below; table titles/captions belong centered above
the table in IEEE style). Moved each "TABLE I."/"TABLE II." caption
paragraph from immediately after its table's closing </w:tbl> to
immediately before that table's opening <w:tbl>, across all 7
affected tables (2 each for Hrishikesh/Ebin/Goutham, 1 for Jaipal,
who has only one table).

Verified: all 4 open cleanly, page counts unchanged (6 pages each),
bag-of-words diff shows zero words added or removed, and visually
confirmed on Hrishikesh's Table I that the caption now renders above
the table.
</commit_message>
<xml_diff>
--- a/documents/EbinJoseph_X25142224/EbinJoseph_X25142224.docx
+++ b/documents/EbinJoseph_X25142224/EbinJoseph_X25142224.docx
@@ -190,6 +190,17 @@
       </w:pPr>
       <w:r>
         <w:t xml:space="preserve">The fog node buffers every incoming reading in a bare object literal keyed on sensor_type::site_id, not a Map, an array, or a ring buffer—addReading() appends straight into station.groups[key], and on a fixed WINDOW_SECONDS timer, snapshotAndClear() walks that object with Object.keys(), packages each non-empty key into a group, and resets station.groups to a fresh {} so readings that land immediately afterward start a new window rather than leaking into the one just closed. Each closed group is reduced to five figures—count, minimum, maximum, average, and the last-arrived reading—and checked against Table I's four alert rules before it ever leaves the fog node.</w:t>
+      </w:r>
+    </w:p>
+    <w:p>
+      <w:pPr>
+        <w:pStyle w:val="tablecaption"/>
+      </w:pPr>
+      <w:r>
+        <w:t xml:space="preserve">TABLE I.</w:t>
+      </w:r>
+      <w:r>
+        <w:t xml:space="preserve">   ALERT THRESHOLDS (EVALUATED ON THE WINDOW AGGREGATE)</w:t>
       </w:r>
     </w:p>
     <w:tbl>
@@ -437,17 +448,6 @@
     </w:tbl>
     <w:p>
       <w:pPr>
-        <w:pStyle w:val="tablecaption"/>
-      </w:pPr>
-      <w:r>
-        <w:t xml:space="preserve">TABLE I.</w:t>
-      </w:r>
-      <w:r>
-        <w:t xml:space="preserve">   ALERT THRESHOLDS (EVALUATED ON THE WINDOW AGGREGATE)</w:t>
-      </w:r>
-    </w:p>
-    <w:p>
-      <w:pPr>
         <w:pStyle w:val="BodyText"/>
       </w:pPr>
       <w:r>
@@ -856,6 +856,17 @@
       </w:pPr>
       <w:r>
         <w:t xml:space="preserve">All 121 tests, broken down by module in Table II, pass against the LocalStack-backed development setup, and the handful that touch real client-construction logic were checked a second time against the fixes confirmed on the live AWS deployment covered in Section III-D.</w:t>
+      </w:r>
+    </w:p>
+    <w:p>
+      <w:pPr>
+        <w:pStyle w:val="tablecaption"/>
+      </w:pPr>
+      <w:r>
+        <w:t xml:space="preserve">TABLE II.</w:t>
+      </w:r>
+      <w:r>
+        <w:t xml:space="preserve">   AUTOMATED TEST SUITE BY MODULE</w:t>
       </w:r>
     </w:p>
     <w:tbl>
@@ -1101,17 +1112,6 @@
         </w:tc>
       </w:tr>
     </w:tbl>
-    <w:p>
-      <w:pPr>
-        <w:pStyle w:val="tablecaption"/>
-      </w:pPr>
-      <w:r>
-        <w:t xml:space="preserve">TABLE II.</w:t>
-      </w:r>
-      <w:r>
-        <w:t xml:space="preserve">   AUTOMATED TEST SUITE BY MODULE</w:t>
-      </w:r>
-    </w:p>
     <w:p>
       <w:pPr>
         <w:pStyle w:val="BodyText"/>

</xml_diff>